<commit_message>
Addition of developement log in word file
</commit_message>
<xml_diff>
--- a/Documentations/יומן פיתוח אפליקציית A2C CRM.docx
+++ b/Documentations/יומן פיתוח אפליקציית A2C CRM.docx
@@ -285,7 +285,6 @@
           <w:b/>
           <w:bCs/>
           <w:rtl/>
-          <w:lang w:val="en-IL"/>
         </w:rPr>
       </w:pPr>
       <w:r>
@@ -293,7 +292,6 @@
           <w:rFonts w:ascii="Segoe UI Emoji" w:hAnsi="Segoe UI Emoji" w:cs="Segoe UI Emoji"/>
           <w:b/>
           <w:bCs/>
-          <w:lang w:val="en-IL"/>
         </w:rPr>
         <w:t>❌</w:t>
       </w:r>
@@ -301,7 +299,6 @@
         <w:rPr>
           <w:b/>
           <w:bCs/>
-          <w:lang w:val="en-IL"/>
         </w:rPr>
         <w:t xml:space="preserve"> </w:t>
       </w:r>
@@ -318,7 +315,6 @@
         <w:rPr>
           <w:b/>
           <w:bCs/>
-          <w:lang w:val="en-IL"/>
         </w:rPr>
         <w:t>:</w:t>
       </w:r>
@@ -330,14 +326,12 @@
         <w:rPr>
           <w:b/>
           <w:bCs/>
-          <w:lang w:val="en-IL"/>
-        </w:rPr>
-      </w:pPr>
-      <w:r>
-        <w:rPr>
-          <w:b/>
-          <w:bCs/>
-          <w:lang w:val="en-IL"/>
+        </w:rPr>
+      </w:pPr>
+      <w:r>
+        <w:rPr>
+          <w:b/>
+          <w:bCs/>
         </w:rPr>
         <w:t>"DefaultConnection": "</w:t>
       </w:r>
@@ -346,7 +340,6 @@
           <w:b/>
           <w:bCs/>
           <w:color w:val="EE0000"/>
-          <w:lang w:val="en-IL"/>
         </w:rPr>
         <w:t>Host=127.0.0.</w:t>
       </w:r>
@@ -356,7 +349,6 @@
           <w:b/>
           <w:bCs/>
           <w:color w:val="EE0000"/>
-          <w:lang w:val="en-IL"/>
         </w:rPr>
         <w:t>1</w:t>
       </w:r>
@@ -364,7 +356,6 @@
         <w:rPr>
           <w:b/>
           <w:bCs/>
-          <w:lang w:val="en-IL"/>
         </w:rPr>
         <w:t>;Port</w:t>
       </w:r>
@@ -373,7 +364,6 @@
         <w:rPr>
           <w:b/>
           <w:bCs/>
-          <w:lang w:val="en-IL"/>
         </w:rPr>
         <w:t>=</w:t>
       </w:r>
@@ -382,7 +372,6 @@
         <w:rPr>
           <w:b/>
           <w:bCs/>
-          <w:lang w:val="en-IL"/>
         </w:rPr>
         <w:t>5432;Database</w:t>
       </w:r>
@@ -391,7 +380,6 @@
         <w:rPr>
           <w:b/>
           <w:bCs/>
-          <w:lang w:val="en-IL"/>
         </w:rPr>
         <w:t>=a2c_</w:t>
       </w:r>
@@ -400,7 +388,6 @@
         <w:rPr>
           <w:b/>
           <w:bCs/>
-          <w:lang w:val="en-IL"/>
         </w:rPr>
         <w:t>crm;Username</w:t>
       </w:r>
@@ -409,7 +396,6 @@
         <w:rPr>
           <w:b/>
           <w:bCs/>
-          <w:lang w:val="en-IL"/>
         </w:rPr>
         <w:t>=</w:t>
       </w:r>
@@ -418,7 +404,6 @@
         <w:rPr>
           <w:b/>
           <w:bCs/>
-          <w:lang w:val="en-IL"/>
         </w:rPr>
         <w:t>postgres;Password</w:t>
       </w:r>
@@ -427,7 +412,6 @@
         <w:rPr>
           <w:b/>
           <w:bCs/>
-          <w:lang w:val="en-IL"/>
         </w:rPr>
         <w:t>=postgres"</w:t>
       </w:r>
@@ -437,11 +421,9 @@
         <w:pStyle w:val="ListParagraph"/>
         <w:bidi/>
         <w:rPr>
-          <w:rFonts w:hint="cs"/>
-          <w:b/>
-          <w:bCs/>
-          <w:rtl/>
-          <w:lang w:val="en-IL"/>
+          <w:b/>
+          <w:bCs/>
+          <w:rtl/>
         </w:rPr>
       </w:pPr>
     </w:p>
@@ -528,7 +510,6 @@
           <w:rFonts w:ascii="Segoe UI Emoji" w:hAnsi="Segoe UI Emoji" w:cs="Segoe UI Emoji"/>
           <w:b/>
           <w:bCs/>
-          <w:lang w:val="en-IL"/>
         </w:rPr>
         <w:t>✅</w:t>
       </w:r>
@@ -536,7 +517,6 @@
         <w:rPr>
           <w:b/>
           <w:bCs/>
-          <w:lang w:val="en-IL"/>
         </w:rPr>
         <w:t xml:space="preserve"> </w:t>
       </w:r>
@@ -553,7 +533,6 @@
         <w:rPr>
           <w:b/>
           <w:bCs/>
-          <w:lang w:val="en-IL"/>
         </w:rPr>
         <w:t>:</w:t>
       </w:r>
@@ -563,7 +542,6 @@
           <w:b/>
           <w:bCs/>
           <w:rtl/>
-          <w:lang w:val="en-IL"/>
         </w:rPr>
         <w:t xml:space="preserve"> </w:t>
       </w:r>
@@ -571,7 +549,6 @@
         <w:rPr>
           <w:b/>
           <w:bCs/>
-          <w:lang w:val="en-IL"/>
         </w:rPr>
         <w:t>H</w:t>
       </w:r>
@@ -580,7 +557,6 @@
           <w:rFonts w:hint="eastAsia"/>
           <w:b/>
           <w:bCs/>
-          <w:lang w:val="en-IL"/>
         </w:rPr>
         <w:t xml:space="preserve">ost= </w:t>
       </w:r>
@@ -632,14 +608,12 @@
         <w:rPr>
           <w:b/>
           <w:bCs/>
-          <w:lang w:val="en-IL"/>
-        </w:rPr>
-      </w:pPr>
-      <w:r>
-        <w:rPr>
-          <w:b/>
-          <w:bCs/>
-          <w:lang w:val="en-IL"/>
+        </w:rPr>
+      </w:pPr>
+      <w:r>
+        <w:rPr>
+          <w:b/>
+          <w:bCs/>
         </w:rPr>
         <w:t>"</w:t>
       </w:r>
@@ -648,7 +622,6 @@
         <w:rPr>
           <w:b/>
           <w:bCs/>
-          <w:lang w:val="en-IL"/>
         </w:rPr>
         <w:t>ConnectionStrings</w:t>
       </w:r>
@@ -657,7 +630,6 @@
         <w:rPr>
           <w:b/>
           <w:bCs/>
-          <w:lang w:val="en-IL"/>
         </w:rPr>
         <w:t>": {</w:t>
       </w:r>
@@ -667,7 +639,6 @@
         <w:pStyle w:val="ListParagraph"/>
         <w:bidi/>
         <w:rPr>
-          <w:rFonts w:hint="eastAsia"/>
           <w:b/>
           <w:bCs/>
           <w:lang w:val="en-US"/>
@@ -677,7 +648,6 @@
         <w:rPr>
           <w:b/>
           <w:bCs/>
-          <w:lang w:val="en-IL"/>
         </w:rPr>
         <w:t xml:space="preserve">  "</w:t>
       </w:r>
@@ -686,7 +656,6 @@
         <w:rPr>
           <w:b/>
           <w:bCs/>
-          <w:lang w:val="en-IL"/>
         </w:rPr>
         <w:t>DefaultConnection</w:t>
       </w:r>
@@ -695,7 +664,6 @@
         <w:rPr>
           <w:b/>
           <w:bCs/>
-          <w:lang w:val="en-IL"/>
         </w:rPr>
         <w:t>": "</w:t>
       </w:r>
@@ -705,7 +673,6 @@
           <w:b/>
           <w:bCs/>
           <w:highlight w:val="yellow"/>
-          <w:lang w:val="en-IL"/>
         </w:rPr>
         <w:t>Host=host.docker.internal</w:t>
       </w:r>
@@ -714,7 +681,6 @@
         <w:rPr>
           <w:b/>
           <w:bCs/>
-          <w:lang w:val="en-IL"/>
         </w:rPr>
         <w:t>;Port=</w:t>
       </w:r>
@@ -723,7 +689,6 @@
         <w:rPr>
           <w:b/>
           <w:bCs/>
-          <w:lang w:val="en-IL"/>
         </w:rPr>
         <w:t>5432;Database</w:t>
       </w:r>
@@ -732,7 +697,6 @@
         <w:rPr>
           <w:b/>
           <w:bCs/>
-          <w:lang w:val="en-IL"/>
         </w:rPr>
         <w:t>=a2c_</w:t>
       </w:r>
@@ -741,7 +705,6 @@
         <w:rPr>
           <w:b/>
           <w:bCs/>
-          <w:lang w:val="en-IL"/>
         </w:rPr>
         <w:t>crm;Username</w:t>
       </w:r>
@@ -750,7 +713,6 @@
         <w:rPr>
           <w:b/>
           <w:bCs/>
-          <w:lang w:val="en-IL"/>
         </w:rPr>
         <w:t>=</w:t>
       </w:r>
@@ -759,7 +721,6 @@
         <w:rPr>
           <w:b/>
           <w:bCs/>
-          <w:lang w:val="en-IL"/>
         </w:rPr>
         <w:t>postgres;Password</w:t>
       </w:r>
@@ -768,7 +729,6 @@
         <w:rPr>
           <w:b/>
           <w:bCs/>
-          <w:lang w:val="en-IL"/>
         </w:rPr>
         <w:t>=postgres"</w:t>
       </w:r>
@@ -790,7 +750,6 @@
         <w:rPr>
           <w:b/>
           <w:bCs/>
-          <w:lang w:val="en-IL"/>
         </w:rPr>
       </w:pPr>
       <w:r>
@@ -798,7 +757,6 @@
           <w:rFonts w:ascii="Segoe UI Emoji" w:hAnsi="Segoe UI Emoji" w:cs="Segoe UI Emoji"/>
           <w:b/>
           <w:bCs/>
-          <w:lang w:val="en-IL"/>
         </w:rPr>
         <w:t>🔍</w:t>
       </w:r>
@@ -806,7 +764,6 @@
         <w:rPr>
           <w:b/>
           <w:bCs/>
-          <w:lang w:val="en-IL"/>
         </w:rPr>
         <w:t xml:space="preserve"> </w:t>
       </w:r>
@@ -815,7 +772,6 @@
           <w:b/>
           <w:bCs/>
           <w:rtl/>
-          <w:lang w:val="en-IL"/>
         </w:rPr>
         <w:t>מה זה אומר בפועל</w:t>
       </w:r>
@@ -823,7 +779,6 @@
         <w:rPr>
           <w:b/>
           <w:bCs/>
-          <w:lang w:val="en-IL"/>
         </w:rPr>
         <w:t>?</w:t>
       </w:r>
@@ -832,21 +787,14 @@
       <w:pPr>
         <w:pStyle w:val="ListParagraph"/>
         <w:bidi/>
-        <w:rPr>
-          <w:lang w:val="en-IL"/>
-        </w:rPr>
-      </w:pPr>
-      <w:r>
-        <w:rPr>
-          <w:rtl/>
-          <w:lang w:val="en-IL"/>
+      </w:pPr>
+      <w:r>
+        <w:rPr>
+          <w:rtl/>
         </w:rPr>
         <w:t>זה קורה כאשר</w:t>
       </w:r>
       <w:r>
-        <w:rPr>
-          <w:lang w:val="en-IL"/>
-        </w:rPr>
         <w:t>:</w:t>
       </w:r>
     </w:p>
@@ -858,14 +806,10 @@
           <w:numId w:val="2"/>
         </w:numPr>
         <w:bidi/>
-        <w:rPr>
-          <w:lang w:val="en-IL"/>
-        </w:rPr>
-      </w:pPr>
-      <w:r>
-        <w:rPr>
-          <w:rtl/>
-          <w:lang w:val="en-IL"/>
+      </w:pPr>
+      <w:r>
+        <w:rPr>
+          <w:rtl/>
         </w:rPr>
         <w:t>האפליקציה </w:t>
       </w:r>
@@ -874,7 +818,6 @@
           <w:b/>
           <w:bCs/>
           <w:rtl/>
-          <w:lang w:val="en-IL"/>
         </w:rPr>
         <w:t>לא רצה בתוך</w:t>
       </w:r>
@@ -882,35 +825,24 @@
         <w:rPr>
           <w:b/>
           <w:bCs/>
-          <w:lang w:val="en-IL"/>
         </w:rPr>
         <w:t xml:space="preserve"> Docker</w:t>
       </w:r>
       <w:r>
-        <w:rPr>
-          <w:lang w:val="en-IL"/>
-        </w:rPr>
         <w:t> (</w:t>
       </w:r>
       <w:r>
         <w:rPr>
           <w:rtl/>
-          <w:lang w:val="en-IL"/>
         </w:rPr>
         <w:t>או לא באותה רשת כמו </w:t>
       </w:r>
       <w:proofErr w:type="spellStart"/>
       <w:r>
-        <w:rPr>
-          <w:lang w:val="en-IL"/>
-        </w:rPr>
         <w:t>db</w:t>
       </w:r>
       <w:proofErr w:type="spellEnd"/>
       <w:r>
-        <w:rPr>
-          <w:lang w:val="en-IL"/>
-        </w:rPr>
         <w:t>).</w:t>
       </w:r>
     </w:p>
@@ -922,48 +854,31 @@
           <w:numId w:val="2"/>
         </w:numPr>
         <w:bidi/>
-        <w:rPr>
-          <w:lang w:val="en-IL"/>
-        </w:rPr>
-      </w:pPr>
-      <w:r>
-        <w:rPr>
-          <w:rtl/>
-          <w:lang w:val="en-IL"/>
+      </w:pPr>
+      <w:r>
+        <w:rPr>
+          <w:rtl/>
         </w:rPr>
         <w:t>או שה־</w:t>
       </w:r>
       <w:r>
-        <w:rPr>
-          <w:lang w:val="en-IL"/>
-        </w:rPr>
         <w:t xml:space="preserve">connection string </w:t>
       </w:r>
       <w:r>
         <w:rPr>
           <w:rtl/>
-          <w:lang w:val="en-IL"/>
         </w:rPr>
         <w:t>עדיין מוגדר עם </w:t>
       </w:r>
       <w:r>
-        <w:rPr>
-          <w:lang w:val="en-IL"/>
-        </w:rPr>
         <w:t>Host=</w:t>
       </w:r>
       <w:proofErr w:type="spellStart"/>
       <w:r>
-        <w:rPr>
-          <w:lang w:val="en-IL"/>
-        </w:rPr>
         <w:t>db</w:t>
       </w:r>
       <w:proofErr w:type="spellEnd"/>
       <w:r>
-        <w:rPr>
-          <w:lang w:val="en-IL"/>
-        </w:rPr>
         <w:t> </w:t>
       </w:r>
       <w:r>
@@ -971,7 +886,6 @@
           <w:b/>
           <w:bCs/>
           <w:rtl/>
-          <w:lang w:val="en-IL"/>
         </w:rPr>
         <w:t>אבל האפליקציה רצה מחוץ לדוקר</w:t>
       </w:r>
@@ -979,7 +893,6 @@
         <w:rPr>
           <w:rFonts w:hint="cs"/>
           <w:rtl/>
-          <w:lang w:val="en-IL"/>
         </w:rPr>
         <w:t xml:space="preserve"> </w:t>
       </w:r>
@@ -1005,9 +918,6 @@
         <w:t>isual Studio 2022</w:t>
       </w:r>
       <w:r>
-        <w:rPr>
-          <w:lang w:val="en-IL"/>
-        </w:rPr>
         <w:t xml:space="preserve"> </w:t>
       </w:r>
       <w:r>
@@ -1021,50 +931,37 @@
       <w:r>
         <w:rPr>
           <w:rtl/>
-          <w:lang w:val="en-IL"/>
         </w:rPr>
         <w:t>ואז</w:t>
       </w:r>
       <w:r>
-        <w:rPr>
-          <w:lang w:val="en-IL"/>
-        </w:rPr>
         <w:t xml:space="preserve"> </w:t>
       </w:r>
       <w:r>
         <w:rPr>
           <w:rFonts w:hint="cs"/>
           <w:rtl/>
-          <w:lang w:val="en-IL"/>
         </w:rPr>
         <w:t xml:space="preserve">אין כל הגדרה של </w:t>
       </w:r>
       <w:proofErr w:type="spellStart"/>
       <w:r>
-        <w:rPr>
-          <w:lang w:val="en-IL"/>
-        </w:rPr>
         <w:t>db</w:t>
       </w:r>
       <w:proofErr w:type="spellEnd"/>
       <w:r>
-        <w:rPr>
-          <w:lang w:val="en-IL"/>
-        </w:rPr>
         <w:t> </w:t>
       </w:r>
       <w:r>
         <w:rPr>
           <w:rFonts w:hint="cs"/>
           <w:rtl/>
-          <w:lang w:val="en-IL"/>
         </w:rPr>
         <w:t xml:space="preserve"> (כמו שקיים ב </w:t>
       </w:r>
       <w:r>
         <w:rPr>
           <w:rFonts w:hint="eastAsia"/>
-          <w:lang w:val="en-IL"/>
         </w:rPr>
         <w:t>Docker-</w:t>
       </w:r>
@@ -1072,7 +969,6 @@
       <w:r>
         <w:rPr>
           <w:rFonts w:hint="eastAsia"/>
-          <w:lang w:val="en-IL"/>
         </w:rPr>
         <w:t>compose.yml</w:t>
       </w:r>
@@ -1088,42 +984,930 @@
     </w:p>
     <w:p>
       <w:pPr>
+        <w:pStyle w:val="ListParagraph"/>
         <w:bidi/>
-        <w:ind w:left="360"/>
-        <w:rPr>
-          <w:lang w:val="en-GB"/>
-        </w:rPr>
-      </w:pPr>
+        <w:rPr>
+          <w:b/>
+          <w:bCs/>
+          <w:lang w:val="en-IL"/>
+        </w:rPr>
+      </w:pPr>
+      <w:r>
+        <w:rPr>
+          <w:rFonts w:ascii="Segoe UI Emoji" w:hAnsi="Segoe UI Emoji" w:cs="Segoe UI Emoji"/>
+          <w:b/>
+          <w:bCs/>
+          <w:lang w:val="en-IL"/>
+        </w:rPr>
+        <w:t>🧱</w:t>
+      </w:r>
+      <w:r>
+        <w:rPr>
+          <w:b/>
+          <w:bCs/>
+          <w:lang w:val="en-IL"/>
+        </w:rPr>
+        <w:t xml:space="preserve"> </w:t>
+      </w:r>
+      <w:r>
+        <w:rPr>
+          <w:b/>
+          <w:bCs/>
+          <w:rtl/>
+        </w:rPr>
+        <w:t>מה זה</w:t>
+      </w:r>
+      <w:r>
+        <w:rPr>
+          <w:b/>
+          <w:bCs/>
+          <w:lang w:val="en-IL"/>
+        </w:rPr>
+        <w:t xml:space="preserve"> Docker?</w:t>
+      </w:r>
+    </w:p>
+    <w:p>
+      <w:pPr>
+        <w:pStyle w:val="ListParagraph"/>
+        <w:bidi/>
+        <w:rPr>
+          <w:lang w:val="en-IL"/>
+        </w:rPr>
+      </w:pPr>
+      <w:r>
+        <w:rPr>
+          <w:lang w:val="en-IL"/>
+        </w:rPr>
+        <w:t xml:space="preserve">Docker </w:t>
+      </w:r>
+      <w:r>
+        <w:rPr>
+          <w:rtl/>
+        </w:rPr>
+        <w:t>הוא </w:t>
+      </w:r>
+      <w:r>
+        <w:rPr>
+          <w:b/>
+          <w:bCs/>
+          <w:rtl/>
+        </w:rPr>
+        <w:t>פלטפורמה להרצת קונטיינרים</w:t>
+      </w:r>
+      <w:r>
+        <w:rPr>
+          <w:rtl/>
+        </w:rPr>
+        <w:t> </w:t>
+      </w:r>
+      <w:r>
+        <w:rPr>
+          <w:lang w:val="en-IL"/>
+        </w:rPr>
+        <w:t xml:space="preserve">– </w:t>
+      </w:r>
+      <w:r>
+        <w:rPr>
+          <w:rtl/>
+        </w:rPr>
+        <w:t>כלומר, סביבה מבודדת שבה אפליקציה יכולה לרוץ עם כל התלויות שלה (קוד, ספריות, קונפיגורציות וכו')</w:t>
+      </w:r>
+      <w:r>
+        <w:rPr>
+          <w:lang w:val="en-IL"/>
+        </w:rPr>
+        <w:t>.</w:t>
+      </w:r>
+    </w:p>
+    <w:p>
+      <w:pPr>
+        <w:pStyle w:val="ListParagraph"/>
+        <w:bidi/>
+        <w:rPr>
+          <w:b/>
+          <w:bCs/>
+          <w:lang w:val="en-IL"/>
+        </w:rPr>
+      </w:pPr>
+      <w:r>
+        <w:rPr>
+          <w:rFonts w:ascii="Segoe UI Emoji" w:hAnsi="Segoe UI Emoji" w:cs="Segoe UI Emoji"/>
+          <w:b/>
+          <w:bCs/>
+          <w:lang w:val="en-IL"/>
+        </w:rPr>
+        <w:t>📦</w:t>
+      </w:r>
+      <w:r>
+        <w:rPr>
+          <w:b/>
+          <w:bCs/>
+          <w:lang w:val="en-IL"/>
+        </w:rPr>
+        <w:t xml:space="preserve"> </w:t>
+      </w:r>
+      <w:r>
+        <w:rPr>
+          <w:b/>
+          <w:bCs/>
+          <w:rtl/>
+          <w:lang w:val="en-IL"/>
+        </w:rPr>
+        <w:t>מה זה קונטיינר</w:t>
+      </w:r>
+      <w:r>
+        <w:rPr>
+          <w:b/>
+          <w:bCs/>
+          <w:lang w:val="en-IL"/>
+        </w:rPr>
+        <w:t>?</w:t>
+      </w:r>
+    </w:p>
+    <w:p>
+      <w:pPr>
+        <w:pStyle w:val="ListParagraph"/>
+        <w:bidi/>
+        <w:rPr>
+          <w:lang w:val="en-IL"/>
+        </w:rPr>
+      </w:pPr>
+      <w:r>
+        <w:rPr>
+          <w:rtl/>
+          <w:lang w:val="en-IL"/>
+        </w:rPr>
+        <w:t>קונטיינר הוא </w:t>
+      </w:r>
+      <w:r>
+        <w:rPr>
+          <w:b/>
+          <w:bCs/>
+          <w:rtl/>
+          <w:lang w:val="en-IL"/>
+        </w:rPr>
+        <w:t>יחידת הרצה</w:t>
+      </w:r>
+      <w:r>
+        <w:rPr>
+          <w:rtl/>
+          <w:lang w:val="en-IL"/>
+        </w:rPr>
+        <w:t> בתוך</w:t>
+      </w:r>
+      <w:r>
+        <w:rPr>
+          <w:lang w:val="en-IL"/>
+        </w:rPr>
+        <w:t xml:space="preserve"> Docker. </w:t>
+      </w:r>
+      <w:r>
+        <w:rPr>
+          <w:rtl/>
+          <w:lang w:val="en-IL"/>
+        </w:rPr>
+        <w:t>כל קונטיינר הוא תהליך נפרד שמריץ אפליקציה מסוימת, לדוגמה</w:t>
+      </w:r>
+      <w:r>
+        <w:rPr>
+          <w:lang w:val="en-IL"/>
+        </w:rPr>
+        <w:t>:</w:t>
+      </w:r>
+    </w:p>
+    <w:p>
+      <w:pPr>
+        <w:pStyle w:val="ListParagraph"/>
+        <w:numPr>
+          <w:ilvl w:val="0"/>
+          <w:numId w:val="3"/>
+        </w:numPr>
+        <w:bidi/>
+        <w:rPr>
+          <w:lang w:val="en-IL"/>
+        </w:rPr>
+      </w:pPr>
+      <w:r>
+        <w:rPr>
+          <w:rtl/>
+          <w:lang w:val="en-IL"/>
+        </w:rPr>
+        <w:t>קונטיינר אחד מריץ את ה־</w:t>
+      </w:r>
+      <w:r>
+        <w:rPr>
+          <w:lang w:val="en-IL"/>
+        </w:rPr>
+        <w:t xml:space="preserve">API </w:t>
+      </w:r>
+      <w:r>
+        <w:rPr>
+          <w:rtl/>
+          <w:lang w:val="en-IL"/>
+        </w:rPr>
+        <w:t>שלך</w:t>
+      </w:r>
+      <w:r>
+        <w:rPr>
+          <w:lang w:val="en-IL"/>
+        </w:rPr>
+        <w:t>.</w:t>
+      </w:r>
+    </w:p>
+    <w:p>
+      <w:pPr>
+        <w:pStyle w:val="ListParagraph"/>
+        <w:numPr>
+          <w:ilvl w:val="0"/>
+          <w:numId w:val="3"/>
+        </w:numPr>
+        <w:bidi/>
+        <w:rPr>
+          <w:lang w:val="en-IL"/>
+        </w:rPr>
+      </w:pPr>
+      <w:r>
+        <w:rPr>
+          <w:rtl/>
+          <w:lang w:val="en-IL"/>
+        </w:rPr>
+        <w:lastRenderedPageBreak/>
+        <w:t>קונטיינר אחר מריץ את</w:t>
+      </w:r>
+      <w:r>
+        <w:rPr>
+          <w:lang w:val="en-IL"/>
+        </w:rPr>
+        <w:t xml:space="preserve"> PostgreSQL.</w:t>
+      </w:r>
+    </w:p>
+    <w:p>
+      <w:pPr>
+        <w:pStyle w:val="ListParagraph"/>
+        <w:bidi/>
+        <w:rPr>
+          <w:lang w:val="en-IL"/>
+        </w:rPr>
+      </w:pPr>
+      <w:r>
+        <w:rPr>
+          <w:rtl/>
+          <w:lang w:val="en-IL"/>
+        </w:rPr>
+        <w:t>כל קונטיינר </w:t>
+      </w:r>
+      <w:r>
+        <w:rPr>
+          <w:b/>
+          <w:bCs/>
+          <w:rtl/>
+          <w:lang w:val="en-IL"/>
+        </w:rPr>
+        <w:t>מבודד</w:t>
+      </w:r>
+      <w:r>
+        <w:rPr>
+          <w:rtl/>
+          <w:lang w:val="en-IL"/>
+        </w:rPr>
+        <w:t> מהמערכת הראשית ומהקונטיינרים האחרים, אלא אם כן מחברים אותם לרשת משותפת</w:t>
+      </w:r>
+      <w:r>
+        <w:rPr>
+          <w:lang w:val="en-IL"/>
+        </w:rPr>
+        <w:t>.</w:t>
+      </w:r>
+    </w:p>
+    <w:p>
+      <w:pPr>
+        <w:pStyle w:val="ListParagraph"/>
+        <w:bidi/>
+        <w:rPr>
+          <w:b/>
+          <w:bCs/>
+          <w:lang w:val="en-IL"/>
+        </w:rPr>
+      </w:pPr>
+      <w:r>
+        <w:rPr>
+          <w:rFonts w:ascii="Segoe UI Emoji" w:hAnsi="Segoe UI Emoji" w:cs="Segoe UI Emoji"/>
+          <w:b/>
+          <w:bCs/>
+          <w:lang w:val="en-IL"/>
+        </w:rPr>
+        <w:t>🌐</w:t>
+      </w:r>
+      <w:r>
+        <w:rPr>
+          <w:b/>
+          <w:bCs/>
+          <w:rtl/>
+          <w:lang w:val="en-IL"/>
+        </w:rPr>
+        <w:t>רשתות בין קונטיינרים</w:t>
+      </w:r>
+    </w:p>
+    <w:p>
+      <w:pPr>
+        <w:pStyle w:val="ListParagraph"/>
+        <w:bidi/>
+        <w:rPr>
+          <w:lang w:val="en-IL"/>
+        </w:rPr>
+      </w:pPr>
+      <w:r>
+        <w:rPr>
+          <w:rtl/>
+          <w:lang w:val="en-IL"/>
+        </w:rPr>
+        <w:t>כשאתה מריץ כמה קונטיינרים עם </w:t>
+      </w:r>
+      <w:r>
+        <w:rPr>
+          <w:lang w:val="en-IL"/>
+        </w:rPr>
+        <w:t xml:space="preserve">docker-compose, </w:t>
+      </w:r>
+      <w:r>
+        <w:rPr>
+          <w:rtl/>
+          <w:lang w:val="en-IL"/>
+        </w:rPr>
+        <w:t>הם מחוברים אוטומטית לרשת פנימית משותפת. לכן</w:t>
+      </w:r>
+      <w:r>
+        <w:rPr>
+          <w:lang w:val="en-IL"/>
+        </w:rPr>
+        <w:t>:</w:t>
+      </w:r>
+    </w:p>
+    <w:p>
+      <w:pPr>
+        <w:pStyle w:val="ListParagraph"/>
+        <w:numPr>
+          <w:ilvl w:val="0"/>
+          <w:numId w:val="4"/>
+        </w:numPr>
+        <w:bidi/>
+        <w:rPr>
+          <w:lang w:val="en-IL"/>
+        </w:rPr>
+      </w:pPr>
+      <w:r>
+        <w:rPr>
+          <w:rtl/>
+          <w:lang w:val="en-IL"/>
+        </w:rPr>
+        <w:t>קונטיינר ה־</w:t>
+      </w:r>
+      <w:r>
+        <w:rPr>
+          <w:lang w:val="en-IL"/>
+        </w:rPr>
+        <w:t xml:space="preserve">API </w:t>
+      </w:r>
+      <w:r>
+        <w:rPr>
+          <w:rtl/>
+          <w:lang w:val="en-IL"/>
+        </w:rPr>
+        <w:t>יכול לגשת ל־</w:t>
+      </w:r>
+      <w:r>
+        <w:rPr>
+          <w:lang w:val="en-IL"/>
+        </w:rPr>
+        <w:t xml:space="preserve">PostgreSQL </w:t>
+      </w:r>
+      <w:r>
+        <w:rPr>
+          <w:rtl/>
+          <w:lang w:val="en-IL"/>
+        </w:rPr>
+        <w:t>דרך השם </w:t>
+      </w:r>
+      <w:proofErr w:type="spellStart"/>
+      <w:r>
+        <w:rPr>
+          <w:lang w:val="en-IL"/>
+        </w:rPr>
+        <w:t>db</w:t>
+      </w:r>
+      <w:proofErr w:type="spellEnd"/>
+      <w:r>
+        <w:rPr>
+          <w:lang w:val="en-IL"/>
+        </w:rPr>
+        <w:t> (</w:t>
+      </w:r>
+      <w:r>
+        <w:rPr>
+          <w:rtl/>
+          <w:lang w:val="en-IL"/>
+        </w:rPr>
+        <w:t>שזה שם השירות</w:t>
+      </w:r>
+      <w:r>
+        <w:rPr>
+          <w:lang w:val="en-IL"/>
+        </w:rPr>
+        <w:t>).</w:t>
+      </w:r>
+    </w:p>
+    <w:p>
+      <w:pPr>
+        <w:pStyle w:val="ListParagraph"/>
+        <w:numPr>
+          <w:ilvl w:val="0"/>
+          <w:numId w:val="4"/>
+        </w:numPr>
+        <w:bidi/>
+        <w:rPr>
+          <w:lang w:val="en-IL"/>
+        </w:rPr>
+      </w:pPr>
+      <w:r>
+        <w:rPr>
+          <w:rtl/>
+          <w:lang w:val="en-IL"/>
+        </w:rPr>
+        <w:t>זה עובד רק </w:t>
+      </w:r>
+      <w:r>
+        <w:rPr>
+          <w:b/>
+          <w:bCs/>
+          <w:rtl/>
+          <w:lang w:val="en-IL"/>
+        </w:rPr>
+        <w:t>אם שניהם רצים בתוך</w:t>
+      </w:r>
+      <w:r>
+        <w:rPr>
+          <w:b/>
+          <w:bCs/>
+          <w:lang w:val="en-IL"/>
+        </w:rPr>
+        <w:t xml:space="preserve"> Docker</w:t>
+      </w:r>
+      <w:r>
+        <w:rPr>
+          <w:lang w:val="en-IL"/>
+        </w:rPr>
+        <w:t> </w:t>
+      </w:r>
+      <w:r>
+        <w:rPr>
+          <w:rtl/>
+          <w:lang w:val="en-IL"/>
+        </w:rPr>
+        <w:t>ובאותה רשת</w:t>
+      </w:r>
+      <w:r>
+        <w:rPr>
+          <w:lang w:val="en-IL"/>
+        </w:rPr>
+        <w:t>.</w:t>
+      </w:r>
+    </w:p>
+    <w:p>
+      <w:pPr>
+        <w:pStyle w:val="ListParagraph"/>
+        <w:bidi/>
+        <w:rPr>
+          <w:b/>
+          <w:bCs/>
+          <w:lang w:val="en-IL"/>
+        </w:rPr>
+      </w:pPr>
+      <w:r>
+        <w:rPr>
+          <w:rFonts w:ascii="Segoe UI Emoji" w:hAnsi="Segoe UI Emoji" w:cs="Segoe UI Emoji"/>
+          <w:b/>
+          <w:bCs/>
+          <w:lang w:val="en-IL"/>
+        </w:rPr>
+        <w:t>🖥️</w:t>
+      </w:r>
+      <w:r>
+        <w:rPr>
+          <w:b/>
+          <w:bCs/>
+          <w:lang w:val="en-IL"/>
+        </w:rPr>
+        <w:t xml:space="preserve"> </w:t>
+      </w:r>
+      <w:r>
+        <w:rPr>
+          <w:b/>
+          <w:bCs/>
+          <w:rtl/>
+          <w:lang w:val="en-IL"/>
+        </w:rPr>
+        <w:t>מה קורה כשאתה מריץ את האפליקציה מחוץ לדוקר</w:t>
+      </w:r>
+      <w:r>
+        <w:rPr>
+          <w:b/>
+          <w:bCs/>
+          <w:lang w:val="en-IL"/>
+        </w:rPr>
+        <w:t xml:space="preserve"> (</w:t>
+      </w:r>
+      <w:r>
+        <w:rPr>
+          <w:b/>
+          <w:bCs/>
+          <w:rtl/>
+          <w:lang w:val="en-IL"/>
+        </w:rPr>
+        <w:t>למשל דרך</w:t>
+      </w:r>
+      <w:r>
+        <w:rPr>
+          <w:b/>
+          <w:bCs/>
+          <w:lang w:val="en-IL"/>
+        </w:rPr>
+        <w:t xml:space="preserve"> Visual Studio)?</w:t>
+      </w:r>
+    </w:p>
+    <w:p>
+      <w:pPr>
+        <w:pStyle w:val="ListParagraph"/>
+        <w:numPr>
+          <w:ilvl w:val="0"/>
+          <w:numId w:val="5"/>
+        </w:numPr>
+        <w:bidi/>
+        <w:rPr>
+          <w:lang w:val="en-IL"/>
+        </w:rPr>
+      </w:pPr>
+      <w:r>
+        <w:rPr>
+          <w:rtl/>
+          <w:lang w:val="en-IL"/>
+        </w:rPr>
+        <w:t>האפליקציה רצה </w:t>
+      </w:r>
+      <w:r>
+        <w:rPr>
+          <w:b/>
+          <w:bCs/>
+          <w:rtl/>
+          <w:lang w:val="en-IL"/>
+        </w:rPr>
+        <w:t>על המחשב שלך</w:t>
+      </w:r>
+      <w:r>
+        <w:rPr>
+          <w:lang w:val="en-IL"/>
+        </w:rPr>
+        <w:t xml:space="preserve">, </w:t>
+      </w:r>
+      <w:r>
+        <w:rPr>
+          <w:rtl/>
+          <w:lang w:val="en-IL"/>
+        </w:rPr>
+        <w:t>לא בתוך קונטיינר</w:t>
+      </w:r>
+      <w:r>
+        <w:rPr>
+          <w:lang w:val="en-IL"/>
+        </w:rPr>
+        <w:t>.</w:t>
+      </w:r>
+    </w:p>
+    <w:p>
+      <w:pPr>
+        <w:pStyle w:val="ListParagraph"/>
+        <w:numPr>
+          <w:ilvl w:val="0"/>
+          <w:numId w:val="5"/>
+        </w:numPr>
+        <w:bidi/>
+        <w:rPr>
+          <w:lang w:val="en-IL"/>
+        </w:rPr>
+      </w:pPr>
+      <w:r>
+        <w:rPr>
+          <w:rtl/>
+          <w:lang w:val="en-IL"/>
+        </w:rPr>
+        <w:t>לכן היא לא מכירה את השם </w:t>
+      </w:r>
+      <w:proofErr w:type="spellStart"/>
+      <w:r>
+        <w:rPr>
+          <w:lang w:val="en-IL"/>
+        </w:rPr>
+        <w:t>db</w:t>
+      </w:r>
+      <w:proofErr w:type="spellEnd"/>
+      <w:r>
+        <w:rPr>
+          <w:lang w:val="en-IL"/>
+        </w:rPr>
+        <w:t xml:space="preserve">, </w:t>
+      </w:r>
+      <w:r>
+        <w:rPr>
+          <w:rtl/>
+          <w:lang w:val="en-IL"/>
+        </w:rPr>
+        <w:t>כי זה שם פנימי ברשת של</w:t>
+      </w:r>
+      <w:r>
+        <w:rPr>
+          <w:lang w:val="en-IL"/>
+        </w:rPr>
+        <w:t xml:space="preserve"> Docker.</w:t>
+      </w:r>
+    </w:p>
+    <w:p>
+      <w:pPr>
+        <w:pStyle w:val="ListParagraph"/>
+        <w:numPr>
+          <w:ilvl w:val="0"/>
+          <w:numId w:val="5"/>
+        </w:numPr>
+        <w:bidi/>
+        <w:rPr>
+          <w:lang w:val="en-IL"/>
+        </w:rPr>
+      </w:pPr>
+      <w:r>
+        <w:rPr>
+          <w:rtl/>
+          <w:lang w:val="en-IL"/>
+        </w:rPr>
+        <w:t>היא כן יכולה לגשת ל־</w:t>
+      </w:r>
+      <w:r>
+        <w:rPr>
+          <w:lang w:val="en-IL"/>
+        </w:rPr>
+        <w:t xml:space="preserve">PostgreSQL </w:t>
+      </w:r>
+      <w:r>
+        <w:rPr>
+          <w:rtl/>
+          <w:lang w:val="en-IL"/>
+        </w:rPr>
+        <w:t>דרך </w:t>
+      </w:r>
+      <w:r>
+        <w:rPr>
+          <w:lang w:val="en-IL"/>
+        </w:rPr>
+        <w:t>localhost </w:t>
+      </w:r>
+      <w:r>
+        <w:rPr>
+          <w:rtl/>
+          <w:lang w:val="en-IL"/>
+        </w:rPr>
+        <w:t>או </w:t>
+      </w:r>
+      <w:proofErr w:type="spellStart"/>
+      <w:r>
+        <w:rPr>
+          <w:lang w:val="en-IL"/>
+        </w:rPr>
+        <w:t>host.docker.internal</w:t>
+      </w:r>
+      <w:proofErr w:type="spellEnd"/>
+      <w:r>
+        <w:rPr>
+          <w:lang w:val="en-IL"/>
+        </w:rPr>
+        <w:t>.</w:t>
+      </w:r>
+    </w:p>
+    <w:p>
+      <w:pPr>
+        <w:pStyle w:val="ListParagraph"/>
+        <w:bidi/>
+        <w:rPr>
+          <w:b/>
+          <w:bCs/>
+          <w:lang w:val="en-IL"/>
+        </w:rPr>
+      </w:pPr>
+      <w:r>
+        <w:rPr>
+          <w:rFonts w:ascii="Segoe UI Emoji" w:hAnsi="Segoe UI Emoji" w:cs="Segoe UI Emoji"/>
+          <w:b/>
+          <w:bCs/>
+          <w:lang w:val="en-IL"/>
+        </w:rPr>
+        <w:t>🧭</w:t>
+      </w:r>
+      <w:r>
+        <w:rPr>
+          <w:b/>
+          <w:bCs/>
+          <w:lang w:val="en-IL"/>
+        </w:rPr>
+        <w:t xml:space="preserve"> </w:t>
+      </w:r>
+      <w:r>
+        <w:rPr>
+          <w:b/>
+          <w:bCs/>
+          <w:rtl/>
+          <w:lang w:val="en-IL"/>
+        </w:rPr>
+        <w:t>מה זה </w:t>
+      </w:r>
+      <w:proofErr w:type="spellStart"/>
+      <w:proofErr w:type="gramStart"/>
+      <w:r>
+        <w:rPr>
+          <w:b/>
+          <w:bCs/>
+          <w:lang w:val="en-IL"/>
+        </w:rPr>
+        <w:t>host.docker</w:t>
+      </w:r>
+      <w:proofErr w:type="gramEnd"/>
+      <w:r>
+        <w:rPr>
+          <w:b/>
+          <w:bCs/>
+          <w:lang w:val="en-IL"/>
+        </w:rPr>
+        <w:t>.internal</w:t>
+      </w:r>
+      <w:proofErr w:type="spellEnd"/>
+      <w:r>
+        <w:rPr>
+          <w:b/>
+          <w:bCs/>
+          <w:lang w:val="en-IL"/>
+        </w:rPr>
+        <w:t>?</w:t>
+      </w:r>
+    </w:p>
+    <w:p>
+      <w:pPr>
+        <w:pStyle w:val="ListParagraph"/>
+        <w:bidi/>
+        <w:rPr>
+          <w:lang w:val="en-IL"/>
+        </w:rPr>
+      </w:pPr>
+      <w:r>
+        <w:rPr>
+          <w:rtl/>
+          <w:lang w:val="en-IL"/>
+        </w:rPr>
+        <w:t>זה שם מיוחד ש־</w:t>
+      </w:r>
+      <w:r>
+        <w:rPr>
+          <w:lang w:val="en-IL"/>
+        </w:rPr>
+        <w:t xml:space="preserve">Docker </w:t>
+      </w:r>
+      <w:r>
+        <w:rPr>
+          <w:rtl/>
+          <w:lang w:val="en-IL"/>
+        </w:rPr>
+        <w:t>הגדיר כדי לאפשר </w:t>
+      </w:r>
+      <w:r>
+        <w:rPr>
+          <w:b/>
+          <w:bCs/>
+          <w:rtl/>
+          <w:lang w:val="en-IL"/>
+        </w:rPr>
+        <w:t>לקונטיינר לגשת למחשב שלך</w:t>
+      </w:r>
+      <w:r>
+        <w:rPr>
+          <w:rtl/>
+          <w:lang w:val="en-IL"/>
+        </w:rPr>
+        <w:t> </w:t>
+      </w:r>
+      <w:r>
+        <w:rPr>
+          <w:lang w:val="en-IL"/>
+        </w:rPr>
+        <w:t>(host machine).</w:t>
+      </w:r>
+    </w:p>
+    <w:p>
+      <w:pPr>
+        <w:pStyle w:val="ListParagraph"/>
+        <w:numPr>
+          <w:ilvl w:val="0"/>
+          <w:numId w:val="6"/>
+        </w:numPr>
+        <w:bidi/>
+        <w:rPr>
+          <w:lang w:val="en-IL"/>
+        </w:rPr>
+      </w:pPr>
+      <w:r>
+        <w:rPr>
+          <w:rtl/>
+          <w:lang w:val="en-IL"/>
+        </w:rPr>
+        <w:t>אם</w:t>
+      </w:r>
+      <w:r>
+        <w:rPr>
+          <w:lang w:val="en-IL"/>
+        </w:rPr>
+        <w:t xml:space="preserve"> PostgreSQL </w:t>
+      </w:r>
+      <w:r>
+        <w:rPr>
+          <w:rtl/>
+          <w:lang w:val="en-IL"/>
+        </w:rPr>
+        <w:t>רץ </w:t>
+      </w:r>
+      <w:r>
+        <w:rPr>
+          <w:b/>
+          <w:bCs/>
+          <w:rtl/>
+          <w:lang w:val="en-IL"/>
+        </w:rPr>
+        <w:t>על המחשב שלך</w:t>
+      </w:r>
+      <w:r>
+        <w:rPr>
+          <w:rtl/>
+          <w:lang w:val="en-IL"/>
+        </w:rPr>
+        <w:t> (ולא בדוקר), אז קונטיינר ה־</w:t>
+      </w:r>
+      <w:r>
+        <w:rPr>
+          <w:lang w:val="en-IL"/>
+        </w:rPr>
+        <w:t xml:space="preserve">API </w:t>
+      </w:r>
+      <w:r>
+        <w:rPr>
+          <w:rtl/>
+          <w:lang w:val="en-IL"/>
+        </w:rPr>
+        <w:t>יכול להתחבר אליו דרך</w:t>
+      </w:r>
+      <w:r>
+        <w:rPr>
+          <w:lang w:val="en-IL"/>
+        </w:rPr>
+        <w:t>:</w:t>
+      </w:r>
       <w:r>
         <w:rPr>
           <w:rFonts w:hint="cs"/>
-          <w:b/>
-          <w:bCs/>
-          <w:rtl/>
-          <w:lang w:val="en-IL"/>
-        </w:rPr>
-        <w:t>סיכום:</w:t>
-      </w:r>
-      <w:r>
-        <w:rPr>
-          <w:b/>
-          <w:bCs/>
-          <w:rtl/>
-          <w:lang w:val="en-IL"/>
-        </w:rPr>
-        <w:br/>
-      </w:r>
+          <w:rtl/>
+          <w:lang w:val="en-IL"/>
+        </w:rPr>
+        <w:t xml:space="preserve"> </w:t>
+      </w:r>
+      <w:proofErr w:type="spellStart"/>
+      <w:r>
+        <w:rPr>
+          <w:lang w:val="en-IL"/>
+        </w:rPr>
+        <w:t>host.docker.internal</w:t>
+      </w:r>
+      <w:proofErr w:type="spellEnd"/>
+    </w:p>
+    <w:p>
+      <w:pPr>
+        <w:pStyle w:val="ListParagraph"/>
+        <w:bidi/>
+        <w:rPr>
+          <w:lang w:val="en-IL"/>
+        </w:rPr>
+      </w:pPr>
       <w:r>
         <w:rPr>
           <w:rFonts w:cs="Arial"/>
           <w:rtl/>
-          <w:lang w:val="en-GB"/>
+          <w:lang w:val="en-IL"/>
         </w:rPr>
         <w:drawing>
-          <wp:inline distT="0" distB="0" distL="0" distR="0" wp14:anchorId="6372231B" wp14:editId="2CB9B47A">
-            <wp:extent cx="5496692" cy="1371791"/>
-            <wp:effectExtent l="0" t="0" r="8890" b="0"/>
-            <wp:docPr id="1433021148" name="Picture 1"/>
+          <wp:inline distT="0" distB="0" distL="0" distR="0" wp14:anchorId="78E8C464" wp14:editId="0DF8F202">
+            <wp:extent cx="4109444" cy="1861679"/>
+            <wp:effectExtent l="0" t="0" r="5715" b="5715"/>
+            <wp:docPr id="713256227" name="Picture 1"/>
             <wp:cNvGraphicFramePr>
               <a:graphicFrameLocks xmlns:a="http://schemas.openxmlformats.org/drawingml/2006/main" noChangeAspect="1"/>
             </wp:cNvGraphicFramePr>
@@ -1131,7 +1915,7 @@
               <a:graphicData uri="http://schemas.openxmlformats.org/drawingml/2006/picture">
                 <pic:pic xmlns:pic="http://schemas.openxmlformats.org/drawingml/2006/picture">
                   <pic:nvPicPr>
-                    <pic:cNvPr id="1433021148" name=""/>
+                    <pic:cNvPr id="713256227" name=""/>
                     <pic:cNvPicPr/>
                   </pic:nvPicPr>
                   <pic:blipFill>
@@ -1143,7 +1927,7 @@
                   <pic:spPr>
                     <a:xfrm>
                       <a:off x="0" y="0"/>
-                      <a:ext cx="5496692" cy="1371791"/>
+                      <a:ext cx="4121636" cy="1867202"/>
                     </a:xfrm>
                     <a:prstGeom prst="rect">
                       <a:avLst/>
@@ -1161,17 +1945,24 @@
         <w:pStyle w:val="ListParagraph"/>
         <w:bidi/>
         <w:rPr>
-          <w:rFonts w:hint="cs"/>
-          <w:rtl/>
           <w:lang w:val="en-IL"/>
         </w:rPr>
       </w:pPr>
     </w:p>
     <w:p>
       <w:pPr>
+        <w:pStyle w:val="ListParagraph"/>
         <w:bidi/>
         <w:rPr>
-          <w:rFonts w:hint="eastAsia"/>
+          <w:rtl/>
+          <w:lang w:val="en-IL"/>
+        </w:rPr>
+      </w:pPr>
+    </w:p>
+    <w:p>
+      <w:pPr>
+        <w:bidi/>
+        <w:rPr>
           <w:rtl/>
           <w:lang w:val="en-US"/>
         </w:rPr>
@@ -1458,11 +2249,619 @@
       </w:rPr>
     </w:lvl>
   </w:abstractNum>
+  <w:abstractNum w:abstractNumId="2" w15:restartNumberingAfterBreak="0">
+    <w:nsid w:val="387D5901"/>
+    <w:multiLevelType w:val="multilevel"/>
+    <w:tmpl w:val="AD424262"/>
+    <w:lvl w:ilvl="0">
+      <w:start w:val="1"/>
+      <w:numFmt w:val="bullet"/>
+      <w:lvlText w:val=""/>
+      <w:lvlJc w:val="left"/>
+      <w:pPr>
+        <w:tabs>
+          <w:tab w:val="num" w:pos="720"/>
+        </w:tabs>
+        <w:ind w:left="720" w:hanging="360"/>
+      </w:pPr>
+      <w:rPr>
+        <w:rFonts w:ascii="Symbol" w:hAnsi="Symbol" w:hint="default"/>
+        <w:sz w:val="20"/>
+      </w:rPr>
+    </w:lvl>
+    <w:lvl w:ilvl="1" w:tentative="1">
+      <w:start w:val="1"/>
+      <w:numFmt w:val="bullet"/>
+      <w:lvlText w:val=""/>
+      <w:lvlJc w:val="left"/>
+      <w:pPr>
+        <w:tabs>
+          <w:tab w:val="num" w:pos="1440"/>
+        </w:tabs>
+        <w:ind w:left="1440" w:hanging="360"/>
+      </w:pPr>
+      <w:rPr>
+        <w:rFonts w:ascii="Symbol" w:hAnsi="Symbol" w:hint="default"/>
+        <w:sz w:val="20"/>
+      </w:rPr>
+    </w:lvl>
+    <w:lvl w:ilvl="2" w:tentative="1">
+      <w:start w:val="1"/>
+      <w:numFmt w:val="bullet"/>
+      <w:lvlText w:val=""/>
+      <w:lvlJc w:val="left"/>
+      <w:pPr>
+        <w:tabs>
+          <w:tab w:val="num" w:pos="2160"/>
+        </w:tabs>
+        <w:ind w:left="2160" w:hanging="360"/>
+      </w:pPr>
+      <w:rPr>
+        <w:rFonts w:ascii="Symbol" w:hAnsi="Symbol" w:hint="default"/>
+        <w:sz w:val="20"/>
+      </w:rPr>
+    </w:lvl>
+    <w:lvl w:ilvl="3" w:tentative="1">
+      <w:start w:val="1"/>
+      <w:numFmt w:val="bullet"/>
+      <w:lvlText w:val=""/>
+      <w:lvlJc w:val="left"/>
+      <w:pPr>
+        <w:tabs>
+          <w:tab w:val="num" w:pos="2880"/>
+        </w:tabs>
+        <w:ind w:left="2880" w:hanging="360"/>
+      </w:pPr>
+      <w:rPr>
+        <w:rFonts w:ascii="Symbol" w:hAnsi="Symbol" w:hint="default"/>
+        <w:sz w:val="20"/>
+      </w:rPr>
+    </w:lvl>
+    <w:lvl w:ilvl="4" w:tentative="1">
+      <w:start w:val="1"/>
+      <w:numFmt w:val="bullet"/>
+      <w:lvlText w:val=""/>
+      <w:lvlJc w:val="left"/>
+      <w:pPr>
+        <w:tabs>
+          <w:tab w:val="num" w:pos="3600"/>
+        </w:tabs>
+        <w:ind w:left="3600" w:hanging="360"/>
+      </w:pPr>
+      <w:rPr>
+        <w:rFonts w:ascii="Symbol" w:hAnsi="Symbol" w:hint="default"/>
+        <w:sz w:val="20"/>
+      </w:rPr>
+    </w:lvl>
+    <w:lvl w:ilvl="5" w:tentative="1">
+      <w:start w:val="1"/>
+      <w:numFmt w:val="bullet"/>
+      <w:lvlText w:val=""/>
+      <w:lvlJc w:val="left"/>
+      <w:pPr>
+        <w:tabs>
+          <w:tab w:val="num" w:pos="4320"/>
+        </w:tabs>
+        <w:ind w:left="4320" w:hanging="360"/>
+      </w:pPr>
+      <w:rPr>
+        <w:rFonts w:ascii="Symbol" w:hAnsi="Symbol" w:hint="default"/>
+        <w:sz w:val="20"/>
+      </w:rPr>
+    </w:lvl>
+    <w:lvl w:ilvl="6" w:tentative="1">
+      <w:start w:val="1"/>
+      <w:numFmt w:val="bullet"/>
+      <w:lvlText w:val=""/>
+      <w:lvlJc w:val="left"/>
+      <w:pPr>
+        <w:tabs>
+          <w:tab w:val="num" w:pos="5040"/>
+        </w:tabs>
+        <w:ind w:left="5040" w:hanging="360"/>
+      </w:pPr>
+      <w:rPr>
+        <w:rFonts w:ascii="Symbol" w:hAnsi="Symbol" w:hint="default"/>
+        <w:sz w:val="20"/>
+      </w:rPr>
+    </w:lvl>
+    <w:lvl w:ilvl="7" w:tentative="1">
+      <w:start w:val="1"/>
+      <w:numFmt w:val="bullet"/>
+      <w:lvlText w:val=""/>
+      <w:lvlJc w:val="left"/>
+      <w:pPr>
+        <w:tabs>
+          <w:tab w:val="num" w:pos="5760"/>
+        </w:tabs>
+        <w:ind w:left="5760" w:hanging="360"/>
+      </w:pPr>
+      <w:rPr>
+        <w:rFonts w:ascii="Symbol" w:hAnsi="Symbol" w:hint="default"/>
+        <w:sz w:val="20"/>
+      </w:rPr>
+    </w:lvl>
+    <w:lvl w:ilvl="8" w:tentative="1">
+      <w:start w:val="1"/>
+      <w:numFmt w:val="bullet"/>
+      <w:lvlText w:val=""/>
+      <w:lvlJc w:val="left"/>
+      <w:pPr>
+        <w:tabs>
+          <w:tab w:val="num" w:pos="6480"/>
+        </w:tabs>
+        <w:ind w:left="6480" w:hanging="360"/>
+      </w:pPr>
+      <w:rPr>
+        <w:rFonts w:ascii="Symbol" w:hAnsi="Symbol" w:hint="default"/>
+        <w:sz w:val="20"/>
+      </w:rPr>
+    </w:lvl>
+  </w:abstractNum>
+  <w:abstractNum w:abstractNumId="3" w15:restartNumberingAfterBreak="0">
+    <w:nsid w:val="4E7351E6"/>
+    <w:multiLevelType w:val="multilevel"/>
+    <w:tmpl w:val="6CD8364C"/>
+    <w:lvl w:ilvl="0">
+      <w:start w:val="1"/>
+      <w:numFmt w:val="bullet"/>
+      <w:lvlText w:val=""/>
+      <w:lvlJc w:val="left"/>
+      <w:pPr>
+        <w:tabs>
+          <w:tab w:val="num" w:pos="720"/>
+        </w:tabs>
+        <w:ind w:left="720" w:hanging="360"/>
+      </w:pPr>
+      <w:rPr>
+        <w:rFonts w:ascii="Symbol" w:hAnsi="Symbol" w:hint="default"/>
+        <w:sz w:val="20"/>
+      </w:rPr>
+    </w:lvl>
+    <w:lvl w:ilvl="1" w:tentative="1">
+      <w:start w:val="1"/>
+      <w:numFmt w:val="bullet"/>
+      <w:lvlText w:val=""/>
+      <w:lvlJc w:val="left"/>
+      <w:pPr>
+        <w:tabs>
+          <w:tab w:val="num" w:pos="1440"/>
+        </w:tabs>
+        <w:ind w:left="1440" w:hanging="360"/>
+      </w:pPr>
+      <w:rPr>
+        <w:rFonts w:ascii="Symbol" w:hAnsi="Symbol" w:hint="default"/>
+        <w:sz w:val="20"/>
+      </w:rPr>
+    </w:lvl>
+    <w:lvl w:ilvl="2" w:tentative="1">
+      <w:start w:val="1"/>
+      <w:numFmt w:val="bullet"/>
+      <w:lvlText w:val=""/>
+      <w:lvlJc w:val="left"/>
+      <w:pPr>
+        <w:tabs>
+          <w:tab w:val="num" w:pos="2160"/>
+        </w:tabs>
+        <w:ind w:left="2160" w:hanging="360"/>
+      </w:pPr>
+      <w:rPr>
+        <w:rFonts w:ascii="Symbol" w:hAnsi="Symbol" w:hint="default"/>
+        <w:sz w:val="20"/>
+      </w:rPr>
+    </w:lvl>
+    <w:lvl w:ilvl="3" w:tentative="1">
+      <w:start w:val="1"/>
+      <w:numFmt w:val="bullet"/>
+      <w:lvlText w:val=""/>
+      <w:lvlJc w:val="left"/>
+      <w:pPr>
+        <w:tabs>
+          <w:tab w:val="num" w:pos="2880"/>
+        </w:tabs>
+        <w:ind w:left="2880" w:hanging="360"/>
+      </w:pPr>
+      <w:rPr>
+        <w:rFonts w:ascii="Symbol" w:hAnsi="Symbol" w:hint="default"/>
+        <w:sz w:val="20"/>
+      </w:rPr>
+    </w:lvl>
+    <w:lvl w:ilvl="4" w:tentative="1">
+      <w:start w:val="1"/>
+      <w:numFmt w:val="bullet"/>
+      <w:lvlText w:val=""/>
+      <w:lvlJc w:val="left"/>
+      <w:pPr>
+        <w:tabs>
+          <w:tab w:val="num" w:pos="3600"/>
+        </w:tabs>
+        <w:ind w:left="3600" w:hanging="360"/>
+      </w:pPr>
+      <w:rPr>
+        <w:rFonts w:ascii="Symbol" w:hAnsi="Symbol" w:hint="default"/>
+        <w:sz w:val="20"/>
+      </w:rPr>
+    </w:lvl>
+    <w:lvl w:ilvl="5" w:tentative="1">
+      <w:start w:val="1"/>
+      <w:numFmt w:val="bullet"/>
+      <w:lvlText w:val=""/>
+      <w:lvlJc w:val="left"/>
+      <w:pPr>
+        <w:tabs>
+          <w:tab w:val="num" w:pos="4320"/>
+        </w:tabs>
+        <w:ind w:left="4320" w:hanging="360"/>
+      </w:pPr>
+      <w:rPr>
+        <w:rFonts w:ascii="Symbol" w:hAnsi="Symbol" w:hint="default"/>
+        <w:sz w:val="20"/>
+      </w:rPr>
+    </w:lvl>
+    <w:lvl w:ilvl="6" w:tentative="1">
+      <w:start w:val="1"/>
+      <w:numFmt w:val="bullet"/>
+      <w:lvlText w:val=""/>
+      <w:lvlJc w:val="left"/>
+      <w:pPr>
+        <w:tabs>
+          <w:tab w:val="num" w:pos="5040"/>
+        </w:tabs>
+        <w:ind w:left="5040" w:hanging="360"/>
+      </w:pPr>
+      <w:rPr>
+        <w:rFonts w:ascii="Symbol" w:hAnsi="Symbol" w:hint="default"/>
+        <w:sz w:val="20"/>
+      </w:rPr>
+    </w:lvl>
+    <w:lvl w:ilvl="7" w:tentative="1">
+      <w:start w:val="1"/>
+      <w:numFmt w:val="bullet"/>
+      <w:lvlText w:val=""/>
+      <w:lvlJc w:val="left"/>
+      <w:pPr>
+        <w:tabs>
+          <w:tab w:val="num" w:pos="5760"/>
+        </w:tabs>
+        <w:ind w:left="5760" w:hanging="360"/>
+      </w:pPr>
+      <w:rPr>
+        <w:rFonts w:ascii="Symbol" w:hAnsi="Symbol" w:hint="default"/>
+        <w:sz w:val="20"/>
+      </w:rPr>
+    </w:lvl>
+    <w:lvl w:ilvl="8" w:tentative="1">
+      <w:start w:val="1"/>
+      <w:numFmt w:val="bullet"/>
+      <w:lvlText w:val=""/>
+      <w:lvlJc w:val="left"/>
+      <w:pPr>
+        <w:tabs>
+          <w:tab w:val="num" w:pos="6480"/>
+        </w:tabs>
+        <w:ind w:left="6480" w:hanging="360"/>
+      </w:pPr>
+      <w:rPr>
+        <w:rFonts w:ascii="Symbol" w:hAnsi="Symbol" w:hint="default"/>
+        <w:sz w:val="20"/>
+      </w:rPr>
+    </w:lvl>
+  </w:abstractNum>
+  <w:abstractNum w:abstractNumId="4" w15:restartNumberingAfterBreak="0">
+    <w:nsid w:val="59C8297E"/>
+    <w:multiLevelType w:val="multilevel"/>
+    <w:tmpl w:val="F5508990"/>
+    <w:lvl w:ilvl="0">
+      <w:start w:val="1"/>
+      <w:numFmt w:val="bullet"/>
+      <w:lvlText w:val=""/>
+      <w:lvlJc w:val="left"/>
+      <w:pPr>
+        <w:tabs>
+          <w:tab w:val="num" w:pos="720"/>
+        </w:tabs>
+        <w:ind w:left="720" w:hanging="360"/>
+      </w:pPr>
+      <w:rPr>
+        <w:rFonts w:ascii="Symbol" w:hAnsi="Symbol" w:hint="default"/>
+        <w:sz w:val="20"/>
+      </w:rPr>
+    </w:lvl>
+    <w:lvl w:ilvl="1" w:tentative="1">
+      <w:start w:val="1"/>
+      <w:numFmt w:val="bullet"/>
+      <w:lvlText w:val=""/>
+      <w:lvlJc w:val="left"/>
+      <w:pPr>
+        <w:tabs>
+          <w:tab w:val="num" w:pos="1440"/>
+        </w:tabs>
+        <w:ind w:left="1440" w:hanging="360"/>
+      </w:pPr>
+      <w:rPr>
+        <w:rFonts w:ascii="Symbol" w:hAnsi="Symbol" w:hint="default"/>
+        <w:sz w:val="20"/>
+      </w:rPr>
+    </w:lvl>
+    <w:lvl w:ilvl="2" w:tentative="1">
+      <w:start w:val="1"/>
+      <w:numFmt w:val="bullet"/>
+      <w:lvlText w:val=""/>
+      <w:lvlJc w:val="left"/>
+      <w:pPr>
+        <w:tabs>
+          <w:tab w:val="num" w:pos="2160"/>
+        </w:tabs>
+        <w:ind w:left="2160" w:hanging="360"/>
+      </w:pPr>
+      <w:rPr>
+        <w:rFonts w:ascii="Symbol" w:hAnsi="Symbol" w:hint="default"/>
+        <w:sz w:val="20"/>
+      </w:rPr>
+    </w:lvl>
+    <w:lvl w:ilvl="3" w:tentative="1">
+      <w:start w:val="1"/>
+      <w:numFmt w:val="bullet"/>
+      <w:lvlText w:val=""/>
+      <w:lvlJc w:val="left"/>
+      <w:pPr>
+        <w:tabs>
+          <w:tab w:val="num" w:pos="2880"/>
+        </w:tabs>
+        <w:ind w:left="2880" w:hanging="360"/>
+      </w:pPr>
+      <w:rPr>
+        <w:rFonts w:ascii="Symbol" w:hAnsi="Symbol" w:hint="default"/>
+        <w:sz w:val="20"/>
+      </w:rPr>
+    </w:lvl>
+    <w:lvl w:ilvl="4" w:tentative="1">
+      <w:start w:val="1"/>
+      <w:numFmt w:val="bullet"/>
+      <w:lvlText w:val=""/>
+      <w:lvlJc w:val="left"/>
+      <w:pPr>
+        <w:tabs>
+          <w:tab w:val="num" w:pos="3600"/>
+        </w:tabs>
+        <w:ind w:left="3600" w:hanging="360"/>
+      </w:pPr>
+      <w:rPr>
+        <w:rFonts w:ascii="Symbol" w:hAnsi="Symbol" w:hint="default"/>
+        <w:sz w:val="20"/>
+      </w:rPr>
+    </w:lvl>
+    <w:lvl w:ilvl="5" w:tentative="1">
+      <w:start w:val="1"/>
+      <w:numFmt w:val="bullet"/>
+      <w:lvlText w:val=""/>
+      <w:lvlJc w:val="left"/>
+      <w:pPr>
+        <w:tabs>
+          <w:tab w:val="num" w:pos="4320"/>
+        </w:tabs>
+        <w:ind w:left="4320" w:hanging="360"/>
+      </w:pPr>
+      <w:rPr>
+        <w:rFonts w:ascii="Symbol" w:hAnsi="Symbol" w:hint="default"/>
+        <w:sz w:val="20"/>
+      </w:rPr>
+    </w:lvl>
+    <w:lvl w:ilvl="6" w:tentative="1">
+      <w:start w:val="1"/>
+      <w:numFmt w:val="bullet"/>
+      <w:lvlText w:val=""/>
+      <w:lvlJc w:val="left"/>
+      <w:pPr>
+        <w:tabs>
+          <w:tab w:val="num" w:pos="5040"/>
+        </w:tabs>
+        <w:ind w:left="5040" w:hanging="360"/>
+      </w:pPr>
+      <w:rPr>
+        <w:rFonts w:ascii="Symbol" w:hAnsi="Symbol" w:hint="default"/>
+        <w:sz w:val="20"/>
+      </w:rPr>
+    </w:lvl>
+    <w:lvl w:ilvl="7" w:tentative="1">
+      <w:start w:val="1"/>
+      <w:numFmt w:val="bullet"/>
+      <w:lvlText w:val=""/>
+      <w:lvlJc w:val="left"/>
+      <w:pPr>
+        <w:tabs>
+          <w:tab w:val="num" w:pos="5760"/>
+        </w:tabs>
+        <w:ind w:left="5760" w:hanging="360"/>
+      </w:pPr>
+      <w:rPr>
+        <w:rFonts w:ascii="Symbol" w:hAnsi="Symbol" w:hint="default"/>
+        <w:sz w:val="20"/>
+      </w:rPr>
+    </w:lvl>
+    <w:lvl w:ilvl="8" w:tentative="1">
+      <w:start w:val="1"/>
+      <w:numFmt w:val="bullet"/>
+      <w:lvlText w:val=""/>
+      <w:lvlJc w:val="left"/>
+      <w:pPr>
+        <w:tabs>
+          <w:tab w:val="num" w:pos="6480"/>
+        </w:tabs>
+        <w:ind w:left="6480" w:hanging="360"/>
+      </w:pPr>
+      <w:rPr>
+        <w:rFonts w:ascii="Symbol" w:hAnsi="Symbol" w:hint="default"/>
+        <w:sz w:val="20"/>
+      </w:rPr>
+    </w:lvl>
+  </w:abstractNum>
+  <w:abstractNum w:abstractNumId="5" w15:restartNumberingAfterBreak="0">
+    <w:nsid w:val="6A1F7185"/>
+    <w:multiLevelType w:val="multilevel"/>
+    <w:tmpl w:val="9E525B34"/>
+    <w:lvl w:ilvl="0">
+      <w:start w:val="1"/>
+      <w:numFmt w:val="bullet"/>
+      <w:lvlText w:val=""/>
+      <w:lvlJc w:val="left"/>
+      <w:pPr>
+        <w:tabs>
+          <w:tab w:val="num" w:pos="720"/>
+        </w:tabs>
+        <w:ind w:left="720" w:hanging="360"/>
+      </w:pPr>
+      <w:rPr>
+        <w:rFonts w:ascii="Symbol" w:hAnsi="Symbol" w:hint="default"/>
+        <w:sz w:val="20"/>
+      </w:rPr>
+    </w:lvl>
+    <w:lvl w:ilvl="1" w:tentative="1">
+      <w:start w:val="1"/>
+      <w:numFmt w:val="bullet"/>
+      <w:lvlText w:val=""/>
+      <w:lvlJc w:val="left"/>
+      <w:pPr>
+        <w:tabs>
+          <w:tab w:val="num" w:pos="1440"/>
+        </w:tabs>
+        <w:ind w:left="1440" w:hanging="360"/>
+      </w:pPr>
+      <w:rPr>
+        <w:rFonts w:ascii="Symbol" w:hAnsi="Symbol" w:hint="default"/>
+        <w:sz w:val="20"/>
+      </w:rPr>
+    </w:lvl>
+    <w:lvl w:ilvl="2" w:tentative="1">
+      <w:start w:val="1"/>
+      <w:numFmt w:val="bullet"/>
+      <w:lvlText w:val=""/>
+      <w:lvlJc w:val="left"/>
+      <w:pPr>
+        <w:tabs>
+          <w:tab w:val="num" w:pos="2160"/>
+        </w:tabs>
+        <w:ind w:left="2160" w:hanging="360"/>
+      </w:pPr>
+      <w:rPr>
+        <w:rFonts w:ascii="Symbol" w:hAnsi="Symbol" w:hint="default"/>
+        <w:sz w:val="20"/>
+      </w:rPr>
+    </w:lvl>
+    <w:lvl w:ilvl="3" w:tentative="1">
+      <w:start w:val="1"/>
+      <w:numFmt w:val="bullet"/>
+      <w:lvlText w:val=""/>
+      <w:lvlJc w:val="left"/>
+      <w:pPr>
+        <w:tabs>
+          <w:tab w:val="num" w:pos="2880"/>
+        </w:tabs>
+        <w:ind w:left="2880" w:hanging="360"/>
+      </w:pPr>
+      <w:rPr>
+        <w:rFonts w:ascii="Symbol" w:hAnsi="Symbol" w:hint="default"/>
+        <w:sz w:val="20"/>
+      </w:rPr>
+    </w:lvl>
+    <w:lvl w:ilvl="4" w:tentative="1">
+      <w:start w:val="1"/>
+      <w:numFmt w:val="bullet"/>
+      <w:lvlText w:val=""/>
+      <w:lvlJc w:val="left"/>
+      <w:pPr>
+        <w:tabs>
+          <w:tab w:val="num" w:pos="3600"/>
+        </w:tabs>
+        <w:ind w:left="3600" w:hanging="360"/>
+      </w:pPr>
+      <w:rPr>
+        <w:rFonts w:ascii="Symbol" w:hAnsi="Symbol" w:hint="default"/>
+        <w:sz w:val="20"/>
+      </w:rPr>
+    </w:lvl>
+    <w:lvl w:ilvl="5" w:tentative="1">
+      <w:start w:val="1"/>
+      <w:numFmt w:val="bullet"/>
+      <w:lvlText w:val=""/>
+      <w:lvlJc w:val="left"/>
+      <w:pPr>
+        <w:tabs>
+          <w:tab w:val="num" w:pos="4320"/>
+        </w:tabs>
+        <w:ind w:left="4320" w:hanging="360"/>
+      </w:pPr>
+      <w:rPr>
+        <w:rFonts w:ascii="Symbol" w:hAnsi="Symbol" w:hint="default"/>
+        <w:sz w:val="20"/>
+      </w:rPr>
+    </w:lvl>
+    <w:lvl w:ilvl="6" w:tentative="1">
+      <w:start w:val="1"/>
+      <w:numFmt w:val="bullet"/>
+      <w:lvlText w:val=""/>
+      <w:lvlJc w:val="left"/>
+      <w:pPr>
+        <w:tabs>
+          <w:tab w:val="num" w:pos="5040"/>
+        </w:tabs>
+        <w:ind w:left="5040" w:hanging="360"/>
+      </w:pPr>
+      <w:rPr>
+        <w:rFonts w:ascii="Symbol" w:hAnsi="Symbol" w:hint="default"/>
+        <w:sz w:val="20"/>
+      </w:rPr>
+    </w:lvl>
+    <w:lvl w:ilvl="7" w:tentative="1">
+      <w:start w:val="1"/>
+      <w:numFmt w:val="bullet"/>
+      <w:lvlText w:val=""/>
+      <w:lvlJc w:val="left"/>
+      <w:pPr>
+        <w:tabs>
+          <w:tab w:val="num" w:pos="5760"/>
+        </w:tabs>
+        <w:ind w:left="5760" w:hanging="360"/>
+      </w:pPr>
+      <w:rPr>
+        <w:rFonts w:ascii="Symbol" w:hAnsi="Symbol" w:hint="default"/>
+        <w:sz w:val="20"/>
+      </w:rPr>
+    </w:lvl>
+    <w:lvl w:ilvl="8" w:tentative="1">
+      <w:start w:val="1"/>
+      <w:numFmt w:val="bullet"/>
+      <w:lvlText w:val=""/>
+      <w:lvlJc w:val="left"/>
+      <w:pPr>
+        <w:tabs>
+          <w:tab w:val="num" w:pos="6480"/>
+        </w:tabs>
+        <w:ind w:left="6480" w:hanging="360"/>
+      </w:pPr>
+      <w:rPr>
+        <w:rFonts w:ascii="Symbol" w:hAnsi="Symbol" w:hint="default"/>
+        <w:sz w:val="20"/>
+      </w:rPr>
+    </w:lvl>
+  </w:abstractNum>
   <w:num w:numId="1" w16cid:durableId="1922639782">
     <w:abstractNumId w:val="1"/>
   </w:num>
   <w:num w:numId="2" w16cid:durableId="919288310">
     <w:abstractNumId w:val="0"/>
+  </w:num>
+  <w:num w:numId="3" w16cid:durableId="2113278963">
+    <w:abstractNumId w:val="4"/>
+  </w:num>
+  <w:num w:numId="4" w16cid:durableId="763651920">
+    <w:abstractNumId w:val="5"/>
+  </w:num>
+  <w:num w:numId="5" w16cid:durableId="745424166">
+    <w:abstractNumId w:val="3"/>
+  </w:num>
+  <w:num w:numId="6" w16cid:durableId="13457703">
+    <w:abstractNumId w:val="2"/>
   </w:num>
 </w:numbering>
 </file>
@@ -2381,6 +3780,17 @@
       <w:spacing w:val="5"/>
     </w:rPr>
   </w:style>
+  <w:style w:type="paragraph" w:styleId="NormalWeb">
+    <w:name w:val="Normal (Web)"/>
+    <w:basedOn w:val="Normal"/>
+    <w:uiPriority w:val="99"/>
+    <w:semiHidden/>
+    <w:unhideWhenUsed/>
+    <w:rsid w:val="00BC05DC"/>
+    <w:rPr>
+      <w:rFonts w:ascii="Times New Roman" w:hAnsi="Times New Roman" w:cs="Times New Roman"/>
+    </w:rPr>
+  </w:style>
 </w:styles>
 </file>
 

</xml_diff>